<commit_message>
Council: split predefense dates, fix secretary, add ophthalmologist expert reviews
Predefense protocol now carries two distinct dates: meeting_date 26.08.2026
(the extended department meeting itself) and protocol_date 27.08.2026 (the day
the protocol was filed with the council). Secretary corrected to Barlyqbai N.T.
(senior lecturer), replacing Daurenbayeva N.A.; the attendee roster follows.

Adds two Russian expert reviews by practising ophthalmologists covering the
application demo — the commitment recorded under item 5 of the 26.08.2026
protocol, standing in for a deployment act. Drafts carry placeholders and are
scoped to the demonstration only.

Co-Authored-By: Claude Opus 5 <noreply@anthropic.com>
Claude-Session: https://claude.ai/code/session_01Q4o3PT2wQ4JVKtWSFFBoeH
</commit_message>
<xml_diff>
--- a/defense/docs/reviews/PREDEFENSE_PROTOCOL_KZ_GOST.docx
+++ b/defense/docs/reviews/PREDEFENSE_PROTOCOL_KZ_GOST.docx
@@ -140,7 +140,7 @@
           <w:sz w:val="28"/>
           <w:u w:val="none"/>
         </w:rPr>
-        <w:t>Алматы қ.                                                                              26.08.2026 ж.</w:t>
+        <w:t>Алматы қ.                                                                              27.08.2026 ж.</w:t>
       </w:r>
     </w:p>
     <w:p>
@@ -192,7 +192,7 @@
           <w:sz w:val="28"/>
           <w:u w:val="none"/>
         </w:rPr>
-        <w:t xml:space="preserve"> Дауренбаева Н.А. — PhD, «Компьютерлік инженерия» кафедрасының ассистент-профессоры.</w:t>
+        <w:t xml:space="preserve"> Барлықбай Н.Т. — магистр, «Компьютерлік инженерия» кафедрасының сениор-лекторы.</w:t>
       </w:r>
     </w:p>
     <w:p>
@@ -218,7 +218,7 @@
           <w:sz w:val="28"/>
           <w:u w:val="none"/>
         </w:rPr>
-        <w:t xml:space="preserve"> техника ғылымдарының докторы, «Ақпараттық жүйелер» кафедрасының профессор-зерттеушісі Найзабаева Л.К.; техника ғылымдарының кандидаты, қауымдастырылған профессор, «Ақпараттық жүйелер» кафедрасының меңгерушісі Быков А.А.; «ХАТУ» АҚ ғалым хатшысы, ғылыми кадрларды даярлау департаменті директорының м.а. Есмурзаева А.Б.; «Компьютерлік инженерия» кафедрасының профессорлары: техника ғылымдарының кандидаты, профессор-зерттеуші Бектемысова Г.У., техника ғылымдарының кандидаты, ғылыми-зерттеу қызметі департаментінің директоры Ипалакова М.Т., PhD Mohsin A. Farhad; «Компьютерлік инженерия» кафедрасының қауымдастырылған профессорлары: физика-математика ғылымдарының кандидаты Сапакова С.З., PhD Каимов С.Т., Meer Jaro Khan; «Компьютерлік инженерия» кафедрасының ассистент-профессорлары: PhD Чинибаева Т.Т., PhD Дауренбаева Н.А., PhD Мукажанов Н.К., магистр Джолдасбаев С.К., магистр Бекаулова Ж.М., магистр Козина Л.А., магистр Жакыпбеков С.Ж.; «Компьютерлік инженерия» кафедрасының сениор-лекторлары, магистрлер: Қойшыбай С.С., Тлеуова Ғ.Н., Әкім А.М., Примжанов З., Балгабек А.А., Ембердиева А.Б., Кокенова У.К., Мұхаметқалиева Н.Е., Туржанов У.М., Маманова С.Е., Есмухамедов Н.С.; G1 ассистенттері, магистрлер: Аскербай Е., Сыдықбек Ж.Қ., Маметова Р.</w:t>
+        <w:t xml:space="preserve"> техника ғылымдарының докторы, «Ақпараттық жүйелер» кафедрасының профессор-зерттеушісі Найзабаева Л.К.; техника ғылымдарының кандидаты, қауымдастырылған профессор, «Ақпараттық жүйелер» кафедрасының меңгерушісі Быков А.А.; «ХАТУ» АҚ ғалым хатшысы, ғылыми кадрларды даярлау департаменті директорының м.а. Есмурзаева А.Б.; «Компьютерлік инженерия» кафедрасының профессорлары: техника ғылымдарының кандидаты, профессор-зерттеуші Бектемысова Г.У., техника ғылымдарының кандидаты, ғылыми-зерттеу қызметі департаментінің директоры Ипалакова М.Т., PhD Mohsin A. Farhad; «Компьютерлік инженерия» кафедрасының қауымдастырылған профессорлары: физика-математика ғылымдарының кандидаты Сапакова С.З., PhD Каимов С.Т., Meer Jaro Khan; «Компьютерлік инженерия» кафедрасының ассистент-профессорлары: PhD Чинибаева Т.Т., PhD Дауренбаева Н.А., PhD Мукажанов Н.К., магистр Джолдасбаев С.К., магистр Бекаулова Ж.М., магистр Козина Л.А., магистр Жакыпбеков С.Ж.; «Компьютерлік инженерия» кафедрасының сениор-лекторлары, магистрлер: Барлықбай Н.Т., Қойшыбай С.С., Тлеуова Ғ.Н., Әкім А.М., Примжанов З., Балгабек А.А., Ембердиева А.Б., Кокенова У.К., Туржанов У.М., Маманова С.Е., Есмухамедов Н.С.; G1 ассистенттері, магистрлер: Аскербай Е., Сыдықбек Ж.Қ., Маметова Р.</w:t>
       </w:r>
     </w:p>
     <w:p>
@@ -674,7 +674,7 @@
           <w:sz w:val="28"/>
           <w:u w:val="none"/>
         </w:rPr>
-        <w:t>Мұхаметқалиева Н.Е. — магистр, «Компьютерлік инженерия» кафедрасының сениор-лекторы:</w:t>
+        <w:t>Қойшыбай С.С. — магистр, «Компьютерлік инженерия» кафедрасының сениор-лекторы:</w:t>
       </w:r>
     </w:p>
     <w:p>
@@ -2764,7 +2764,7 @@
         </w:rPr>
         <w:t>1.</w:t>
         <w:tab/>
-        <w:t>Есмухамедов Н.С.-ның «Оптикалық когерентті томографиялық кескіндерді пайдалана отырып, тереңдетіп оқыту негізінде көз торының ауруларын автоматты түрде анықтаудың ақпараттық жүйесі» тақырыбындағы диссертациялық жұмысының нәтижелерін қарау жөніндегі «Компьютерлік инженерия» кафедрасының 2026 жылғы 26.08 кеңейтілген отырысының қорытындылары бекітілсін.</w:t>
+        <w:t>Есмухамедов Н.С.-ның «Оптикалық когерентті томографиялық кескіндерді пайдалана отырып, тереңдетіп оқыту негізінде көз торының ауруларын автоматты түрде анықтаудың ақпараттық жүйесі» тақырыбындағы диссертациялық жұмысының нәтижелерін қарау жөніндегі «Компьютерлік инженерия» кафедрасының 26.08.2026 жылғы кеңейтілген отырысының қорытындылары бекітілсін.</w:t>
       </w:r>
     </w:p>
     <w:p>
@@ -2912,7 +2912,7 @@
                 <w:sz w:val="28"/>
                 <w:u w:val="none"/>
               </w:rPr>
-              <w:t>Отырыс хатшысы, PhD, «Компьютерлік инженерия» кафедрасының ассистент-профессоры</w:t>
+              <w:t>Отырыс хатшысы, магистр, «Компьютерлік инженерия» кафедрасының сениор-лекторы</w:t>
             </w:r>
           </w:p>
         </w:tc>
@@ -2935,7 +2935,7 @@
                 <w:sz w:val="28"/>
                 <w:u w:val="none"/>
               </w:rPr>
-              <w:t>____________ Дауренбаева Н.А.</w:t>
+              <w:t>____________ Барлықбай Н.Т.</w:t>
             </w:r>
           </w:p>
         </w:tc>

</xml_diff>